<commit_message>
Mark the Master's as completed on the Astek resume
Remove “en cours” now that the degree is finished.

Co-authored-by: JellYouness <JellYouness@users.noreply.github.com>
</commit_message>
<xml_diff>
--- a/resume/output/Youness-Jellouli-Astek.docx
+++ b/resume/output/Youness-Jellouli-Astek.docx
@@ -322,7 +322,7 @@
           <w:color w:val="2E3D50"/>
           <w:sz w:val="20"/>
         </w:rPr>
-        <w:t xml:space="preserve"> utilisateurs / jour). Autonome, Git, esprit d'équipe. Master Bac+5 en cours (Ingénierie des systèmes intelligents).</w:t>
+        <w:t xml:space="preserve"> utilisateurs / jour). Autonome, Git, esprit d'équipe. Master Bac+5 (Ingénierie des systèmes intelligents).</w:t>
       </w:r>
     </w:p>
     <w:p>
@@ -1510,7 +1510,7 @@
           <w:color w:val="2E3D50"/>
           <w:sz w:val="20"/>
         </w:rPr>
-        <w:t>Master: Ingénierie des systèmes intelligents (Bac+5, en cours)</w:t>
+        <w:t>Master: Ingénierie des systèmes intelligents</w:t>
       </w:r>
     </w:p>
     <w:p>

</xml_diff>

<commit_message>
Record ValetPass as SBS Data Factory work
Add valetpass.ma to the career profile and SBS bullets on every
tailored resume, using only product facts from the live site.

Co-authored-by: JellYouness <JellYouness@users.noreply.github.com>
</commit_message>
<xml_diff>
--- a/resume/output/Youness-Jellouli-Astek.docx
+++ b/resume/output/Youness-Jellouli-Astek.docx
@@ -392,6 +392,34 @@
         <w:pStyle w:val="ListBullet"/>
         <w:spacing w:before="0" w:after="0" w:line="283" w:lineRule="auto"/>
       </w:pPr>
+      <w:hyperlink r:id="rId13">
+        <w:r>
+          <w:rPr>
+            <w:color w:val="2B7FFF"/>
+            <w:u w:val="single"/>
+            <w:sz w:val="20"/>
+            <w:szCs w:val="20"/>
+            <w:rFonts w:ascii="Times New Roman" w:hAnsi="Times New Roman"/>
+          </w:rPr>
+          <w:t xml:space="preserve">ValetPass</w:t>
+        </w:r>
+      </w:hyperlink>
+      <w:r>
+        <w:rPr>
+          <w:rFonts w:ascii="Times New Roman" w:hAnsi="Times New Roman" w:eastAsia="Times New Roman"/>
+          <w:b w:val="0"/>
+          <w:i w:val="0"/>
+          <w:color w:val="2E3D50"/>
+          <w:sz w:val="20"/>
+        </w:rPr>
+        <w:t xml:space="preserve"> — valet digital (hôtels): pass Wallet, QR, demande de véhicule en temps réel.</w:t>
+      </w:r>
+    </w:p>
+    <w:p>
+      <w:pPr>
+        <w:pStyle w:val="ListBullet"/>
+        <w:spacing w:before="0" w:after="0" w:line="283" w:lineRule="auto"/>
+      </w:pPr>
       <w:r>
         <w:rPr>
           <w:rFonts w:ascii="Times New Roman" w:hAnsi="Times New Roman" w:eastAsia="Times New Roman"/>
@@ -402,7 +430,7 @@
         </w:rPr>
         <w:t xml:space="preserve">Évolution de </w:t>
       </w:r>
-      <w:hyperlink r:id="rId13">
+      <w:hyperlink r:id="rId14">
         <w:r>
           <w:rPr>
             <w:color w:val="2B7FFF"/>
@@ -732,7 +760,7 @@
         </w:rPr>
         <w:t xml:space="preserve">Outils métier en production (France): </w:t>
       </w:r>
-      <w:hyperlink r:id="rId14">
+      <w:hyperlink r:id="rId15">
         <w:r>
           <w:rPr>
             <w:color w:val="2B7FFF"/>
@@ -754,7 +782,7 @@
         </w:rPr>
         <w:t xml:space="preserve">, </w:t>
       </w:r>
-      <w:hyperlink r:id="rId15">
+      <w:hyperlink r:id="rId16">
         <w:r>
           <w:rPr>
             <w:color w:val="2B7FFF"/>
@@ -776,7 +804,7 @@
         </w:rPr>
         <w:t xml:space="preserve">, </w:t>
       </w:r>
-      <w:hyperlink r:id="rId16">
+      <w:hyperlink r:id="rId17">
         <w:r>
           <w:rPr>
             <w:color w:val="2B7FFF"/>
@@ -1169,7 +1197,7 @@
       <w:pPr>
         <w:spacing w:before="60" w:after="0" w:line="252" w:lineRule="auto"/>
       </w:pPr>
-      <w:hyperlink r:id="rId13">
+      <w:hyperlink r:id="rId14">
         <w:r>
           <w:rPr>
             <w:color w:val="2B7FFF"/>
@@ -1212,7 +1240,7 @@
       <w:pPr>
         <w:spacing w:before="60" w:after="0" w:line="252" w:lineRule="auto"/>
       </w:pPr>
-      <w:hyperlink r:id="rId17">
+      <w:hyperlink r:id="rId18">
         <w:r>
           <w:rPr>
             <w:color w:val="2B7FFF"/>
@@ -1255,7 +1283,7 @@
       <w:pPr>
         <w:spacing w:before="60" w:after="0" w:line="252" w:lineRule="auto"/>
       </w:pPr>
-      <w:hyperlink r:id="rId14">
+      <w:hyperlink r:id="rId15">
         <w:r>
           <w:rPr>
             <w:color w:val="2B7FFF"/>
@@ -1298,7 +1326,7 @@
       <w:pPr>
         <w:spacing w:before="60" w:after="0" w:line="252" w:lineRule="auto"/>
       </w:pPr>
-      <w:hyperlink r:id="rId15">
+      <w:hyperlink r:id="rId16">
         <w:r>
           <w:rPr>
             <w:color w:val="2B7FFF"/>

</xml_diff>

<commit_message>
Replace Travel Flow with ValetPass on the public project list
Keep Travel Flow in the career profile only; show ValetPass on
the CVs instead.

Co-authored-by: JellYouness <JellYouness@users.noreply.github.com>
</commit_message>
<xml_diff>
--- a/resume/output/Youness-Jellouli-Astek.docx
+++ b/resume/output/Youness-Jellouli-Astek.docx
@@ -1240,7 +1240,7 @@
       <w:pPr>
         <w:spacing w:before="60" w:after="0" w:line="252" w:lineRule="auto"/>
       </w:pPr>
-      <w:hyperlink r:id="rId18">
+      <w:hyperlink r:id="rId13">
         <w:r>
           <w:rPr>
             <w:color w:val="2B7FFF"/>
@@ -1249,7 +1249,7 @@
             <w:szCs w:val="22"/>
             <w:rFonts w:ascii="Times New Roman" w:hAnsi="Times New Roman"/>
           </w:rPr>
-          <w:t xml:space="preserve">Travel Flow</w:t>
+          <w:t xml:space="preserve">ValetPass</w:t>
         </w:r>
       </w:hyperlink>
       <w:r>
@@ -1260,7 +1260,7 @@
           <w:color w:val="2E3D50"/>
           <w:sz w:val="18"/>
         </w:rPr>
-        <w:t xml:space="preserve">  ·  TypeScript, JavaScript, Python</w:t>
+        <w:t xml:space="preserve">  ·  TypeScript, JavaScript</w:t>
       </w:r>
     </w:p>
     <w:p>
@@ -1276,7 +1276,7 @@
           <w:color w:val="2E3D50"/>
           <w:sz w:val="20"/>
         </w:rPr>
-        <w:t>Optimisation d'itinéraires (problème du voyageur de commerce).</w:t>
+        <w:t>Valet digital pour hôtels: pass Wallet, QR à l'arrivée, demande de véhicule en temps réel.</w:t>
       </w:r>
     </w:p>
     <w:p>

</xml_diff>